<commit_message>
Add link to rep into doc
</commit_message>
<xml_diff>
--- a/Отчет_о_создании_и_инструкция_Баг_из_слов.docx
+++ b/Отчет_о_создании_и_инструкция_Баг_из_слов.docx
@@ -44,6 +44,27 @@
     <w:p>
       <w:r>
         <w:t>Доступ к боту: https://t.me/wordbased_bug_bot. Для работы программы команда запускает её на своём компьютере командой python3 main.py. Пока компьютер выключен или программа остановлена, бот не отвечает.</w:t>
+      </w:r>
+      <w:r>
+        <w:t xml:space="preserve"> Исходный код проекта: </w:t>
+      </w:r>
+      <w:hyperlink r:id="rId11">
+        <w:r>
+          <w:rPr>
+            <w:color w:val="0563C1"/>
+            <w:u w:val="single"/>
+            <w:rFonts w:ascii="Arial" w:hAnsi="Arial"/>
+            <w:sz w:val="20"/>
+          </w:rPr>
+          <w:t>репозитории на GitHub</w:t>
+        </w:r>
+      </w:hyperlink>
+      <w:r>
+        <w:rPr>
+          <w:rFonts w:ascii="Arial" w:hAnsi="Arial"/>
+          <w:sz w:val="20"/>
+        </w:rPr>
+        <w:t>.</w:t>
       </w:r>
     </w:p>
     <w:p>

</xml_diff>